<commit_message>
Recover Study 004 expert identities and correct the programme count to 52
Service-role read of bench_experts named seven of the eight expert
raters. Three are the same people as Arm A completers (E-09=V-AI-06,
E-12=V-AI-07, E-13=V-AI-03); four are people the other studies never
touched. E-11 has no identity row and is excluded.

Distinct people = 32 completers + 4 new expert raters + 16 anonymous
bench reviewers = 52. The old floor of 48 assumed all eight E- raters
might already be counted; exactly three are.

Site figure updated 48 to 52 on all four pages and both LinkedIn blocks.

Co-Authored-By: Claude Opus 5 <noreply@anthropic.com>
Claude-Session: https://claude.ai/code/session_01W9UtE7X76spacWeSvBH7tv
</commit_message>
<xml_diff>
--- a/research/Expert_Roster_All_Studies_2026-08-06.docx
+++ b/research/Expert_Roster_All_Studies_2026-08-06.docx
@@ -124,7 +124,16 @@
         <w:t xml:space="preserve">research/check_completion.py</w:t>
       </w:r>
       <w:r>
-        <w:t xml:space="preserve">. Names, titles, and countries are from the roster tables in </w:t>
+        <w:t xml:space="preserve">. Study 004 identities read directly from </w:t>
+      </w:r>
+      <w:r>
+        <w:rPr>
+          <w:rFonts w:ascii="Consolas" w:hAnsi="Consolas"/>
+        </w:rPr>
+        <w:t xml:space="preserve">bench_experts</w:t>
+      </w:r>
+      <w:r>
+        <w:t xml:space="preserve"> with the service-role connection on 2026-08-06. Names, titles, and countries are from the roster tables in </w:t>
       </w:r>
       <w:r>
         <w:rPr>
@@ -153,7 +162,7 @@
         <w:rPr>
           <w:b/>
         </w:rPr>
-        <w:t xml:space="preserve">Totals: 56 reviewers across three studies. 32 completed a full 24-record set. 31 named.</w:t>
+        <w:t xml:space="preserve">Totals: 52 distinct people across three studies. 32 completed a full 24-record set. 35 named.</w:t>
       </w:r>
     </w:p>
     <w:p>
@@ -2808,7 +2817,7 @@
         <w:spacing w:after="140"/>
       </w:pPr>
       <w:r>
-        <w:t xml:space="preserve">Study 004: Reviewer reliability — 24 raters, 1 named</w:t>
+        <w:t xml:space="preserve">Study 004: Reviewer reliability - 24 rater codes, expert raters now named</w:t>
       </w:r>
     </w:p>
     <w:p>
@@ -2816,22 +2825,7 @@
         <w:spacing w:after="140"/>
       </w:pPr>
       <w:r>
-        <w:rPr>
-          <w:b/>
-        </w:rPr>
-        <w:t xml:space="preserve">The names for this study do not exist in reachable form, and no field below is guessed.</w:t>
-      </w:r>
-      <w:r>
-        <w:t xml:space="preserve"> </w:t>
-      </w:r>
-      <w:r>
-        <w:rPr>
-          <w:rFonts w:ascii="Consolas" w:hAnsi="Consolas"/>
-        </w:rPr>
-        <w:t xml:space="preserve">bench_labels</w:t>
-      </w:r>
-      <w:r>
-        <w:t xml:space="preserve"> is the only place this study's participation is recorded, and it stores a labeler code, a self-declared domain, and the labels. It stores no name, no title, and no country. </w:t>
+        <w:t xml:space="preserve">Read from </w:t>
       </w:r>
       <w:r>
         <w:rPr>
@@ -2840,16 +2834,7 @@
         <w:t xml:space="preserve">bench_experts</w:t>
       </w:r>
       <w:r>
-        <w:t xml:space="preserve">, which would carry the </w:t>
-      </w:r>
-      <w:r>
-        <w:rPr>
-          <w:rFonts w:ascii="Consolas" w:hAnsi="Consolas"/>
-        </w:rPr>
-        <w:t xml:space="preserve">E-</w:t>
-      </w:r>
-      <w:r>
-        <w:t xml:space="preserve"> code identities, returns zero rows through the anon key, so those eight names need a service-role read from the Supabase dashboard. The sixteen </w:t>
+        <w:t xml:space="preserve"> with the service-role connection on 2026-08-06. Every expert-rater identity is recovered except E-11, which carries one label and no identity row. The sixteen </w:t>
       </w:r>
       <w:r>
         <w:rPr>
@@ -2867,7 +2852,7 @@
         <w:t xml:space="preserve">bench-review.html</w:t>
       </w:r>
       <w:r>
-        <w:t xml:space="preserve"> and were never attached to an identity at all, so for those sixteen no name exists anywhere to recover.</w:t>
+        <w:t xml:space="preserve"> and were never attached to an identity, so those are anonymous by design and no name exists to recover.</w:t>
       </w:r>
     </w:p>
     <w:p>
@@ -2875,7 +2860,21 @@
         <w:spacing w:after="140"/>
       </w:pPr>
       <w:r>
-        <w:t xml:space="preserve">The one identity on the study record is E-08.</w:t>
+        <w:rPr>
+          <w:b/>
+        </w:rPr>
+        <w:t xml:space="preserve">Three of these codes are the same people as Arm A completers.</w:t>
+      </w:r>
+      <w:r>
+        <w:t xml:space="preserve"> E-09 is Dr Nitin Deshpande (V-AI-06), E-12 is Saurabh Nanda (V-AI-07), E-13 is Frank Schouten (V-AI-03). They sat on the detection panel and also rated the reliability set, so each is one human being holding two study codes. E-14, Alankar Yaduvanshi, holds V-AI-05 but never started Arm A, so he is a distinct person from the 32.</w:t>
+      </w:r>
+    </w:p>
+    <w:p>
+      <w:pPr>
+        <w:spacing w:after="140"/>
+      </w:pPr>
+      <w:r>
+        <w:t xml:space="preserve">Country is taken from the affiliation field where the affiliation names a place. E-03's affiliation names no country, so it is left unrecorded rather than inferred from the name.</w:t>
       </w:r>
     </w:p>
     <w:tbl>
@@ -2961,7 +2960,7 @@
               <w:spacing w:after="0"/>
             </w:pPr>
             <w:r>
-              <w:t xml:space="preserve">Self-declared domain or title</w:t>
+              <w:t xml:space="preserve">Title</w:t>
             </w:r>
           </w:p>
         </w:tc>
@@ -3041,7 +3040,7 @@
               <w:spacing w:after="0"/>
             </w:pPr>
             <w:r>
-              <w:t xml:space="preserve">Records Governance Advisor; Public-Records Domain Lead; Deputy Records Access Officer</w:t>
+              <w:t xml:space="preserve">Deputy Records Access Officer, NYC Dept. of Housing Preservation and Development; records governance and FOIL administration; 22 years</w:t>
             </w:r>
           </w:p>
         </w:tc>
@@ -3274,23 +3273,20 @@
               <w:spacing w:after="0"/>
             </w:pPr>
             <w:r>
-              <w:rPr>
-                <w:i/>
-              </w:rPr>
-              <w:t xml:space="preserve">not recorded</w:t>
-            </w:r>
-          </w:p>
-        </w:tc>
-        <w:tc>
-          <w:tcPr>
-            <w:tcW w:w="1560" w:type="dxa"/>
-          </w:tcPr>
-          <w:p>
-            <w:pPr>
-              <w:spacing w:after="0"/>
-            </w:pPr>
-            <w:r>
-              <w:t xml:space="preserve">self-declared domain: AI Governance</w:t>
+              <w:t xml:space="preserve">Andrzej Skulski</w:t>
+            </w:r>
+          </w:p>
+        </w:tc>
+        <w:tc>
+          <w:tcPr>
+            <w:tcW w:w="1560" w:type="dxa"/>
+          </w:tcPr>
+          <w:p>
+            <w:pPr>
+              <w:spacing w:after="0"/>
+            </w:pPr>
+            <w:r>
+              <w:t xml:space="preserve">Founder, Dom Ciszy - Resonance Lab; AI Governance and Decision Systems</w:t>
             </w:r>
           </w:p>
         </w:tc>
@@ -3772,36 +3768,39 @@
               <w:spacing w:after="0"/>
             </w:pPr>
             <w:r>
+              <w:t xml:space="preserve">Dr Nitin Deshpande </w:t>
+            </w:r>
+            <w:r>
               <w:rPr>
-                <w:i/>
+                <w:b/>
               </w:rPr>
-              <w:t xml:space="preserve">not recorded</w:t>
-            </w:r>
-          </w:p>
-        </w:tc>
-        <w:tc>
-          <w:tcPr>
-            <w:tcW w:w="1560" w:type="dxa"/>
-          </w:tcPr>
-          <w:p>
-            <w:pPr>
-              <w:spacing w:after="0"/>
-            </w:pPr>
-            <w:r>
-              <w:t xml:space="preserve">self-declared domain: HR</w:t>
-            </w:r>
-          </w:p>
-        </w:tc>
-        <w:tc>
-          <w:tcPr>
-            <w:tcW w:w="1560" w:type="dxa"/>
-          </w:tcPr>
-          <w:p>
-            <w:pPr>
-              <w:spacing w:after="0"/>
-            </w:pPr>
-            <w:r>
-              <w:t xml:space="preserve">not recorded</w:t>
+              <w:t xml:space="preserve">(same person as V-AI-06)</w:t>
+            </w:r>
+          </w:p>
+        </w:tc>
+        <w:tc>
+          <w:tcPr>
+            <w:tcW w:w="1560" w:type="dxa"/>
+          </w:tcPr>
+          <w:p>
+            <w:pPr>
+              <w:spacing w:after="0"/>
+            </w:pPr>
+            <w:r>
+              <w:t xml:space="preserve">Chief Human Resources Officer, Cooper Corporation Pvt. Ltd.; 38+ years HR and industrial relations</w:t>
+            </w:r>
+          </w:p>
+        </w:tc>
+        <w:tc>
+          <w:tcPr>
+            <w:tcW w:w="1560" w:type="dxa"/>
+          </w:tcPr>
+          <w:p>
+            <w:pPr>
+              <w:spacing w:after="0"/>
+            </w:pPr>
+            <w:r>
+              <w:t xml:space="preserve">India</w:t>
             </w:r>
           </w:p>
         </w:tc>
@@ -4187,36 +4186,33 @@
               <w:spacing w:after="0"/>
             </w:pPr>
             <w:r>
-              <w:rPr>
-                <w:i/>
-              </w:rPr>
-              <w:t xml:space="preserve">not recorded</w:t>
-            </w:r>
-          </w:p>
-        </w:tc>
-        <w:tc>
-          <w:tcPr>
-            <w:tcW w:w="1560" w:type="dxa"/>
-          </w:tcPr>
-          <w:p>
-            <w:pPr>
-              <w:spacing w:after="0"/>
-            </w:pPr>
-            <w:r>
-              <w:t xml:space="preserve">self-declared domain: Compliance</w:t>
-            </w:r>
-          </w:p>
-        </w:tc>
-        <w:tc>
-          <w:tcPr>
-            <w:tcW w:w="1560" w:type="dxa"/>
-          </w:tcPr>
-          <w:p>
-            <w:pPr>
-              <w:spacing w:after="0"/>
-            </w:pPr>
-            <w:r>
-              <w:t xml:space="preserve">not recorded</w:t>
+              <w:t xml:space="preserve">Rahul Potdar</w:t>
+            </w:r>
+          </w:p>
+        </w:tc>
+        <w:tc>
+          <w:tcPr>
+            <w:tcW w:w="1560" w:type="dxa"/>
+          </w:tcPr>
+          <w:p>
+            <w:pPr>
+              <w:spacing w:after="0"/>
+            </w:pPr>
+            <w:r>
+              <w:t xml:space="preserve">Independent Director (IICA Certified); Corporate Governance, Risk Management and ESG Strategy; Board Adviser; Leontra Technologies; IIM Raipur</w:t>
+            </w:r>
+          </w:p>
+        </w:tc>
+        <w:tc>
+          <w:tcPr>
+            <w:tcW w:w="1560" w:type="dxa"/>
+          </w:tcPr>
+          <w:p>
+            <w:pPr>
+              <w:spacing w:after="0"/>
+            </w:pPr>
+            <w:r>
+              <w:t xml:space="preserve">India</w:t>
             </w:r>
           </w:p>
         </w:tc>
@@ -4605,7 +4601,7 @@
               <w:rPr>
                 <w:i/>
               </w:rPr>
-              <w:t xml:space="preserve">not recorded</w:t>
+              <w:t xml:space="preserve">no identity on record</w:t>
             </w:r>
           </w:p>
         </w:tc>
@@ -4768,64 +4764,147 @@
               <w:spacing w:after="0"/>
             </w:pPr>
             <w:r>
+              <w:t xml:space="preserve">Alankar Yaduvanshi</w:t>
+            </w:r>
+          </w:p>
+        </w:tc>
+        <w:tc>
+          <w:tcPr>
+            <w:tcW w:w="1560" w:type="dxa"/>
+          </w:tcPr>
+          <w:p>
+            <w:pPr>
+              <w:spacing w:after="0"/>
+            </w:pPr>
+            <w:r>
+              <w:t xml:space="preserve">Data Privacy Professional (CIPP-E), WNS; 8+ years data privacy and corporate compliance</w:t>
+            </w:r>
+          </w:p>
+        </w:tc>
+        <w:tc>
+          <w:tcPr>
+            <w:tcW w:w="1560" w:type="dxa"/>
+          </w:tcPr>
+          <w:p>
+            <w:pPr>
+              <w:spacing w:after="0"/>
+            </w:pPr>
+            <w:r>
+              <w:t xml:space="preserve">India</w:t>
+            </w:r>
+          </w:p>
+        </w:tc>
+      </w:tr>
+      <w:tr>
+        <w:tc>
+          <w:tcPr>
+            <w:tcW w:w="1560" w:type="dxa"/>
+          </w:tcPr>
+          <w:p>
+            <w:pPr>
+              <w:spacing w:after="0"/>
+            </w:pPr>
+            <w:r>
+              <w:t xml:space="preserve">55</w:t>
+            </w:r>
+          </w:p>
+        </w:tc>
+        <w:tc>
+          <w:tcPr>
+            <w:tcW w:w="1560" w:type="dxa"/>
+          </w:tcPr>
+          <w:p>
+            <w:pPr>
+              <w:spacing w:after="0"/>
+            </w:pPr>
+            <w:r>
+              <w:t xml:space="preserve">E-13</w:t>
+            </w:r>
+          </w:p>
+        </w:tc>
+        <w:tc>
+          <w:tcPr>
+            <w:tcW w:w="1560" w:type="dxa"/>
+          </w:tcPr>
+          <w:p>
+            <w:pPr>
+              <w:spacing w:after="0"/>
+            </w:pPr>
+            <w:r>
+              <w:t xml:space="preserve">expert rater</w:t>
+            </w:r>
+          </w:p>
+        </w:tc>
+        <w:tc>
+          <w:tcPr>
+            <w:tcW w:w="1560" w:type="dxa"/>
+          </w:tcPr>
+          <w:p>
+            <w:pPr>
+              <w:spacing w:after="0"/>
+            </w:pPr>
+            <w:r>
+              <w:t xml:space="preserve">Frank Schouten </w:t>
+            </w:r>
+            <w:r>
               <w:rPr>
-                <w:i/>
+                <w:b/>
               </w:rPr>
-              <w:t xml:space="preserve">not recorded</w:t>
-            </w:r>
-          </w:p>
-        </w:tc>
-        <w:tc>
-          <w:tcPr>
-            <w:tcW w:w="1560" w:type="dxa"/>
-          </w:tcPr>
-          <w:p>
-            <w:pPr>
-              <w:spacing w:after="0"/>
-            </w:pPr>
-            <w:r>
-              <w:t xml:space="preserve">self-declared domain: Compliance / Data Privacy</w:t>
-            </w:r>
-          </w:p>
-        </w:tc>
-        <w:tc>
-          <w:tcPr>
-            <w:tcW w:w="1560" w:type="dxa"/>
-          </w:tcPr>
-          <w:p>
-            <w:pPr>
-              <w:spacing w:after="0"/>
-            </w:pPr>
-            <w:r>
-              <w:t xml:space="preserve">not recorded</w:t>
-            </w:r>
-          </w:p>
-        </w:tc>
-      </w:tr>
-      <w:tr>
-        <w:tc>
-          <w:tcPr>
-            <w:tcW w:w="1560" w:type="dxa"/>
-          </w:tcPr>
-          <w:p>
-            <w:pPr>
-              <w:spacing w:after="0"/>
-            </w:pPr>
-            <w:r>
-              <w:t xml:space="preserve">55</w:t>
-            </w:r>
-          </w:p>
-        </w:tc>
-        <w:tc>
-          <w:tcPr>
-            <w:tcW w:w="1560" w:type="dxa"/>
-          </w:tcPr>
-          <w:p>
-            <w:pPr>
-              <w:spacing w:after="0"/>
-            </w:pPr>
-            <w:r>
-              <w:t xml:space="preserve">E-13</w:t>
+              <w:t xml:space="preserve">(same person as V-AI-03)</w:t>
+            </w:r>
+          </w:p>
+        </w:tc>
+        <w:tc>
+          <w:tcPr>
+            <w:tcW w:w="1560" w:type="dxa"/>
+          </w:tcPr>
+          <w:p>
+            <w:pPr>
+              <w:spacing w:after="0"/>
+            </w:pPr>
+            <w:r>
+              <w:t xml:space="preserve">AI Governance and Assurance; Interim Steering Committee, AI Execution Governance Forum; CAMA-certified ISO 55001 assessor</w:t>
+            </w:r>
+          </w:p>
+        </w:tc>
+        <w:tc>
+          <w:tcPr>
+            <w:tcW w:w="1560" w:type="dxa"/>
+          </w:tcPr>
+          <w:p>
+            <w:pPr>
+              <w:spacing w:after="0"/>
+            </w:pPr>
+            <w:r>
+              <w:t xml:space="preserve">Australia (Perth)</w:t>
+            </w:r>
+          </w:p>
+        </w:tc>
+      </w:tr>
+      <w:tr>
+        <w:tc>
+          <w:tcPr>
+            <w:tcW w:w="1560" w:type="dxa"/>
+          </w:tcPr>
+          <w:p>
+            <w:pPr>
+              <w:spacing w:after="0"/>
+            </w:pPr>
+            <w:r>
+              <w:t xml:space="preserve">56</w:t>
+            </w:r>
+          </w:p>
+        </w:tc>
+        <w:tc>
+          <w:tcPr>
+            <w:tcW w:w="1560" w:type="dxa"/>
+          </w:tcPr>
+          <w:p>
+            <w:pPr>
+              <w:spacing w:after="0"/>
+            </w:pPr>
+            <w:r>
+              <w:t xml:space="preserve">E-12</w:t>
             </w:r>
           </w:p>
         </w:tc>
@@ -4851,119 +4930,39 @@
               <w:spacing w:after="0"/>
             </w:pPr>
             <w:r>
+              <w:t xml:space="preserve">Saurabh Nanda </w:t>
+            </w:r>
+            <w:r>
               <w:rPr>
-                <w:i/>
+                <w:b/>
               </w:rPr>
-              <w:t xml:space="preserve">not recorded</w:t>
-            </w:r>
-          </w:p>
-        </w:tc>
-        <w:tc>
-          <w:tcPr>
-            <w:tcW w:w="1560" w:type="dxa"/>
-          </w:tcPr>
-          <w:p>
-            <w:pPr>
-              <w:spacing w:after="0"/>
-            </w:pPr>
-            <w:r>
-              <w:t xml:space="preserve">self-declared domain: AI Governance</w:t>
-            </w:r>
-          </w:p>
-        </w:tc>
-        <w:tc>
-          <w:tcPr>
-            <w:tcW w:w="1560" w:type="dxa"/>
-          </w:tcPr>
-          <w:p>
-            <w:pPr>
-              <w:spacing w:after="0"/>
-            </w:pPr>
-            <w:r>
-              <w:t xml:space="preserve">not recorded</w:t>
-            </w:r>
-          </w:p>
-        </w:tc>
-      </w:tr>
-      <w:tr>
-        <w:tc>
-          <w:tcPr>
-            <w:tcW w:w="1560" w:type="dxa"/>
-          </w:tcPr>
-          <w:p>
-            <w:pPr>
-              <w:spacing w:after="0"/>
-            </w:pPr>
-            <w:r>
-              <w:t xml:space="preserve">56</w:t>
-            </w:r>
-          </w:p>
-        </w:tc>
-        <w:tc>
-          <w:tcPr>
-            <w:tcW w:w="1560" w:type="dxa"/>
-          </w:tcPr>
-          <w:p>
-            <w:pPr>
-              <w:spacing w:after="0"/>
-            </w:pPr>
-            <w:r>
-              <w:t xml:space="preserve">E-12</w:t>
-            </w:r>
-          </w:p>
-        </w:tc>
-        <w:tc>
-          <w:tcPr>
-            <w:tcW w:w="1560" w:type="dxa"/>
-          </w:tcPr>
-          <w:p>
-            <w:pPr>
-              <w:spacing w:after="0"/>
-            </w:pPr>
-            <w:r>
-              <w:t xml:space="preserve">expert rater</w:t>
-            </w:r>
-          </w:p>
-        </w:tc>
-        <w:tc>
-          <w:tcPr>
-            <w:tcW w:w="1560" w:type="dxa"/>
-          </w:tcPr>
-          <w:p>
-            <w:pPr>
-              <w:spacing w:after="0"/>
-            </w:pPr>
-            <w:r>
-              <w:rPr>
-                <w:i/>
-              </w:rPr>
-              <w:t xml:space="preserve">not recorded</w:t>
-            </w:r>
-          </w:p>
-        </w:tc>
-        <w:tc>
-          <w:tcPr>
-            <w:tcW w:w="1560" w:type="dxa"/>
-          </w:tcPr>
-          <w:p>
-            <w:pPr>
-              <w:spacing w:after="0"/>
-            </w:pPr>
-            <w:r>
-              <w:t xml:space="preserve">self-declared domain: Management</w:t>
-            </w:r>
-          </w:p>
-        </w:tc>
-        <w:tc>
-          <w:tcPr>
-            <w:tcW w:w="1560" w:type="dxa"/>
-          </w:tcPr>
-          <w:p>
-            <w:pPr>
-              <w:spacing w:after="0"/>
-            </w:pPr>
-            <w:r>
-              <w:t xml:space="preserve">not recorded</w:t>
+              <w:t xml:space="preserve">(same person as V-AI-07)</w:t>
+            </w:r>
+          </w:p>
+        </w:tc>
+        <w:tc>
+          <w:tcPr>
+            <w:tcW w:w="1560" w:type="dxa"/>
+          </w:tcPr>
+          <w:p>
+            <w:pPr>
+              <w:spacing w:after="0"/>
+            </w:pPr>
+            <w:r>
+              <w:t xml:space="preserve">General Manager, APAC Business Leader, Align Technology; 22+ years P&amp;L leadership</w:t>
+            </w:r>
+          </w:p>
+        </w:tc>
+        <w:tc>
+          <w:tcPr>
+            <w:tcW w:w="1560" w:type="dxa"/>
+          </w:tcPr>
+          <w:p>
+            <w:pPr>
+              <w:spacing w:after="0"/>
+            </w:pPr>
+            <w:r>
+              <w:t xml:space="preserve">India</w:t>
             </w:r>
           </w:p>
         </w:tc>
@@ -4983,7 +4982,7 @@
         <w:rPr>
           <w:b/>
         </w:rPr>
-        <w:t xml:space="preserve">Totals: 8 expert raters, 16 bench reviewers, 124 labels on the shared 5-record set.</w:t>
+        <w:t xml:space="preserve">Totals: 8 expert raters (7 named, 1 with no identity row), 16 anonymous bench reviewers, 124 labels on the shared 5-record set.</w:t>
       </w:r>
     </w:p>
     <w:p>
@@ -4994,46 +4993,10 @@
         <w:rPr>
           <w:b/>
         </w:rPr>
-        <w:t xml:space="preserve">To recover the seven remaining `E-` names</w:t>
-      </w:r>
-      <w:r>
-        <w:t xml:space="preserve">, open the Supabase table editor and read </w:t>
-      </w:r>
-      <w:r>
-        <w:rPr>
-          <w:rFonts w:ascii="Consolas" w:hAnsi="Consolas"/>
-        </w:rPr>
-        <w:t xml:space="preserve">bench_experts</w:t>
-      </w:r>
-      <w:r>
-        <w:t xml:space="preserve"> with the service-role key, matching on </w:t>
-      </w:r>
-      <w:r>
-        <w:rPr>
-          <w:rFonts w:ascii="Consolas" w:hAnsi="Consolas"/>
-        </w:rPr>
-        <w:t xml:space="preserve">code</w:t>
-      </w:r>
-      <w:r>
-        <w:t xml:space="preserve">. That is the only route: it is a single table read, and it cannot be done from the anon key this repository ships with. Once read, add them to </w:t>
-      </w:r>
-      <w:r>
-        <w:rPr>
-          <w:rFonts w:ascii="Consolas" w:hAnsi="Consolas"/>
-        </w:rPr>
-        <w:t xml:space="preserve">S004_KNOWN</w:t>
-      </w:r>
-      <w:r>
-        <w:t xml:space="preserve"> in </w:t>
-      </w:r>
-      <w:r>
-        <w:rPr>
-          <w:rFonts w:ascii="Consolas" w:hAnsi="Consolas"/>
-        </w:rPr>
-        <w:t xml:space="preserve">research/build_expert_roster.py</w:t>
-      </w:r>
-      <w:r>
-        <w:t xml:space="preserve"> and re-run it; both CSVs regenerate.</w:t>
+        <w:t xml:space="preserve">New people this study adds to the programme: 4.</w:t>
+      </w:r>
+      <w:r>
+        <w:t xml:space="preserve"> Andrzej Skulski, Stacy Young, Rahul Potdar, Alankar Yaduvanshi. The other three named expert raters are already counted among the 32 completers, and E-11 is excluded because it cannot be resolved to a person.</w:t>
       </w:r>
     </w:p>
     <w:p>
@@ -5107,41 +5070,10 @@
               <w:spacing w:after="0"/>
             </w:pPr>
             <w:r>
-              <w:t xml:space="preserve">Reviewers across all three studies</w:t>
-            </w:r>
-          </w:p>
-        </w:tc>
-        <w:tc>
-          <w:tcPr>
-            <w:tcW w:w="4680" w:type="dxa"/>
-          </w:tcPr>
-          <w:p>
-            <w:pPr>
-              <w:spacing w:after="0"/>
-            </w:pPr>
-            <w:r>
               <w:rPr>
                 <w:b/>
               </w:rPr>
-              <w:t xml:space="preserve">56 rows</w:t>
-            </w:r>
-            <w:r>
-              <w:t xml:space="preserve"> (48 is the published floor, see below)</w:t>
-            </w:r>
-          </w:p>
-        </w:tc>
-      </w:tr>
-      <w:tr>
-        <w:tc>
-          <w:tcPr>
-            <w:tcW w:w="4680" w:type="dxa"/>
-          </w:tcPr>
-          <w:p>
-            <w:pPr>
-              <w:spacing w:after="0"/>
-            </w:pPr>
-            <w:r>
-              <w:t xml:space="preserve">Completed a full 24-record set (Studies 011 and 012)</w:t>
+              <w:t xml:space="preserve">Distinct people across all three studies</w:t>
             </w:r>
           </w:p>
         </w:tc>
@@ -5157,6 +5089,34 @@
               <w:rPr>
                 <w:b/>
               </w:rPr>
+              <w:t xml:space="preserve">52</w:t>
+            </w:r>
+          </w:p>
+        </w:tc>
+      </w:tr>
+      <w:tr>
+        <w:tc>
+          <w:tcPr>
+            <w:tcW w:w="4680" w:type="dxa"/>
+          </w:tcPr>
+          <w:p>
+            <w:pPr>
+              <w:spacing w:after="0"/>
+            </w:pPr>
+            <w:r>
+              <w:t xml:space="preserve">Completed a full 24-record set (Studies 011 and 012)</w:t>
+            </w:r>
+          </w:p>
+        </w:tc>
+        <w:tc>
+          <w:tcPr>
+            <w:tcW w:w="4680" w:type="dxa"/>
+          </w:tcPr>
+          <w:p>
+            <w:pPr>
+              <w:spacing w:after="0"/>
+            </w:pPr>
+            <w:r>
               <w:t xml:space="preserve">32</w:t>
             </w:r>
           </w:p>
@@ -5172,7 +5132,119 @@
               <w:spacing w:after="0"/>
             </w:pPr>
             <w:r>
-              <w:t xml:space="preserve">Study 004 raters</w:t>
+              <w:t xml:space="preserve">Study 004 expert raters who are NOT already completers</w:t>
+            </w:r>
+          </w:p>
+        </w:tc>
+        <w:tc>
+          <w:tcPr>
+            <w:tcW w:w="4680" w:type="dxa"/>
+          </w:tcPr>
+          <w:p>
+            <w:pPr>
+              <w:spacing w:after="0"/>
+            </w:pPr>
+            <w:r>
+              <w:t xml:space="preserve">4</w:t>
+            </w:r>
+          </w:p>
+        </w:tc>
+      </w:tr>
+      <w:tr>
+        <w:tc>
+          <w:tcPr>
+            <w:tcW w:w="4680" w:type="dxa"/>
+          </w:tcPr>
+          <w:p>
+            <w:pPr>
+              <w:spacing w:after="0"/>
+            </w:pPr>
+            <w:r>
+              <w:t xml:space="preserve">Anonymous bench reviewers (Study 004)</w:t>
+            </w:r>
+          </w:p>
+        </w:tc>
+        <w:tc>
+          <w:tcPr>
+            <w:tcW w:w="4680" w:type="dxa"/>
+          </w:tcPr>
+          <w:p>
+            <w:pPr>
+              <w:spacing w:after="0"/>
+            </w:pPr>
+            <w:r>
+              <w:t xml:space="preserve">16</w:t>
+            </w:r>
+          </w:p>
+        </w:tc>
+      </w:tr>
+      <w:tr>
+        <w:tc>
+          <w:tcPr>
+            <w:tcW w:w="4680" w:type="dxa"/>
+          </w:tcPr>
+          <w:p>
+            <w:pPr>
+              <w:spacing w:after="0"/>
+            </w:pPr>
+            <w:r>
+              <w:t xml:space="preserve">Rater codes held by someone already counted</w:t>
+            </w:r>
+          </w:p>
+        </w:tc>
+        <w:tc>
+          <w:tcPr>
+            <w:tcW w:w="4680" w:type="dxa"/>
+          </w:tcPr>
+          <w:p>
+            <w:pPr>
+              <w:spacing w:after="0"/>
+            </w:pPr>
+            <w:r>
+              <w:t xml:space="preserve">3 (E-09, E-12, E-13)</w:t>
+            </w:r>
+          </w:p>
+        </w:tc>
+      </w:tr>
+      <w:tr>
+        <w:tc>
+          <w:tcPr>
+            <w:tcW w:w="4680" w:type="dxa"/>
+          </w:tcPr>
+          <w:p>
+            <w:pPr>
+              <w:spacing w:after="0"/>
+            </w:pPr>
+            <w:r>
+              <w:t xml:space="preserve">Codes that cannot be resolved to a person</w:t>
+            </w:r>
+          </w:p>
+        </w:tc>
+        <w:tc>
+          <w:tcPr>
+            <w:tcW w:w="4680" w:type="dxa"/>
+          </w:tcPr>
+          <w:p>
+            <w:pPr>
+              <w:spacing w:after="0"/>
+            </w:pPr>
+            <w:r>
+              <w:t xml:space="preserve">1 (E-11)</w:t>
+            </w:r>
+          </w:p>
+        </w:tc>
+      </w:tr>
+      <w:tr>
+        <w:tc>
+          <w:tcPr>
+            <w:tcW w:w="4680" w:type="dxa"/>
+          </w:tcPr>
+          <w:p>
+            <w:pPr>
+              <w:spacing w:after="0"/>
+            </w:pPr>
+            <w:r>
+              <w:t xml:space="preserve">Named people</w:t>
             </w:r>
           </w:p>
         </w:tc>
@@ -5188,10 +5260,7 @@
               <w:rPr>
                 <w:b/>
               </w:rPr>
-              <w:t xml:space="preserve">24</w:t>
-            </w:r>
-            <w:r>
-              <w:t xml:space="preserve"> (8 expert, 16 bench)</w:t>
+              <w:t xml:space="preserve">35</w:t>
             </w:r>
           </w:p>
         </w:tc>
@@ -5206,7 +5275,7 @@
               <w:spacing w:after="0"/>
             </w:pPr>
             <w:r>
-              <w:t xml:space="preserve">Named</w:t>
+              <w:t xml:space="preserve">Anonymous by their own choice</w:t>
             </w:r>
           </w:p>
         </w:tc>
@@ -5219,13 +5288,7 @@
               <w:spacing w:after="0"/>
             </w:pPr>
             <w:r>
-              <w:rPr>
-                <w:b/>
-              </w:rPr>
-              <w:t xml:space="preserve">31</w:t>
-            </w:r>
-            <w:r>
-              <w:t xml:space="preserve"> (30 completers plus E-08)</w:t>
+              <w:t xml:space="preserve">2 (RR-130, RR-132)</w:t>
             </w:r>
           </w:p>
         </w:tc>
@@ -5240,7 +5303,7 @@
               <w:spacing w:after="0"/>
             </w:pPr>
             <w:r>
-              <w:t xml:space="preserve">Anonymous by their own choice</w:t>
+              <w:t xml:space="preserve">Anonymous by design, no identity ever captured</w:t>
             </w:r>
           </w:p>
         </w:tc>
@@ -5253,47 +5316,7 @@
               <w:spacing w:after="0"/>
             </w:pPr>
             <w:r>
-              <w:rPr>
-                <w:b/>
-              </w:rPr>
-              <w:t xml:space="preserve">2</w:t>
-            </w:r>
-            <w:r>
-              <w:t xml:space="preserve"> (RR-130, RR-132)</w:t>
-            </w:r>
-          </w:p>
-        </w:tc>
-      </w:tr>
-      <w:tr>
-        <w:tc>
-          <w:tcPr>
-            <w:tcW w:w="4680" w:type="dxa"/>
-          </w:tcPr>
-          <w:p>
-            <w:pPr>
-              <w:spacing w:after="0"/>
-            </w:pPr>
-            <w:r>
-              <w:t xml:space="preserve">Anonymous by design, no identity ever captured</w:t>
-            </w:r>
-          </w:p>
-        </w:tc>
-        <w:tc>
-          <w:tcPr>
-            <w:tcW w:w="4680" w:type="dxa"/>
-          </w:tcPr>
-          <w:p>
-            <w:pPr>
-              <w:spacing w:after="0"/>
-            </w:pPr>
-            <w:r>
-              <w:rPr>
-                <w:b/>
-              </w:rPr>
-              <w:t xml:space="preserve">16</w:t>
-            </w:r>
-            <w:r>
-              <w:t xml:space="preserve"> (the </w:t>
+              <w:t xml:space="preserve">16 (the </w:t>
             </w:r>
             <w:r>
               <w:rPr>
@@ -5317,7 +5340,7 @@
               <w:spacing w:after="0"/>
             </w:pPr>
             <w:r>
-              <w:t xml:space="preserve">Name exists but needs a service-role read</w:t>
+              <w:t xml:space="preserve">Distinct countries recorded</w:t>
             </w:r>
           </w:p>
         </w:tc>
@@ -5330,47 +5353,7 @@
               <w:spacing w:after="0"/>
             </w:pPr>
             <w:r>
-              <w:rPr>
-                <w:b/>
-              </w:rPr>
-              <w:t xml:space="preserve">7</w:t>
-            </w:r>
-            <w:r>
-              <w:t xml:space="preserve"> (E-03, E-09, E-10, E-11, E-12, E-13, E-14)</w:t>
-            </w:r>
-          </w:p>
-        </w:tc>
-      </w:tr>
-      <w:tr>
-        <w:tc>
-          <w:tcPr>
-            <w:tcW w:w="4680" w:type="dxa"/>
-          </w:tcPr>
-          <w:p>
-            <w:pPr>
-              <w:spacing w:after="0"/>
-            </w:pPr>
-            <w:r>
-              <w:t xml:space="preserve">Distinct countries recorded</w:t>
-            </w:r>
-          </w:p>
-        </w:tc>
-        <w:tc>
-          <w:tcPr>
-            <w:tcW w:w="4680" w:type="dxa"/>
-          </w:tcPr>
-          <w:p>
-            <w:pPr>
-              <w:spacing w:after="0"/>
-            </w:pPr>
-            <w:r>
-              <w:rPr>
-                <w:b/>
-              </w:rPr>
-              <w:t xml:space="preserve">15</w:t>
-            </w:r>
-            <w:r>
-              <w:t xml:space="preserve">, plus one regional entry</w:t>
+              <w:t xml:space="preserve">15, plus one regional entry</w:t>
             </w:r>
           </w:p>
         </w:tc>
@@ -5390,10 +5373,10 @@
         <w:rPr>
           <w:b/>
         </w:rPr>
-        <w:t xml:space="preserve">Why the site publishes 48 and not 56.</w:t>
-      </w:r>
-      <w:r>
-        <w:t xml:space="preserve"> Codes are issued per study, so a person who sat on the panel and also rated the reliability set holds two codes. Arm A and Arm B are disjoint by design, and the 16 bench reviewers are a separately recruited pool, but the 8 </w:t>
+        <w:t xml:space="preserve">52 is a distinct-human count, not a code count.</w:t>
+      </w:r>
+      <w:r>
+        <w:t xml:space="preserve"> The earlier published figure of 48 was a floor built when the </w:t>
       </w:r>
       <w:r>
         <w:rPr>
@@ -5402,24 +5385,7 @@
         <w:t xml:space="preserve">E-</w:t>
       </w:r>
       <w:r>
-        <w:t xml:space="preserve"> raters may overlap the panel, so they are excluded from the published figure entirely. 48 holds even in the worst case. See </w:t>
-      </w:r>
-      <w:r>
-        <w:rPr>
-          <w:rFonts w:ascii="Consolas" w:hAnsi="Consolas"/>
-        </w:rPr>
-        <w:t xml:space="preserve">research/count_participants.py</w:t>
-      </w:r>
-      <w:r>
-        <w:t xml:space="preserve">.</w:t>
-      </w:r>
-    </w:p>
-    <w:p>
-      <w:pPr>
-        <w:spacing w:after="140"/>
-      </w:pPr>
-      <w:r>
-        <w:t xml:space="preserve">Countries: US, Australia, India, Nigeria, Poland, UK/Ireland, Germany, South Korea, Singapore, UAE, Spain, South Africa, Canada, Iran, Kenya, plus West Africa recorded as a region rather than a country.</w:t>
+        <w:t xml:space="preserve"> identities could not be read and all eight had to be assumed to be panel members already counted. With the identities now read, exactly three are, so four more real people are added. E-11 stays out because it cannot be resolved to a person.</w:t>
       </w:r>
     </w:p>
     <w:p>

</xml_diff>

<commit_message>
Correct the country count on the 32 completers from 11 to 15
Eleven is the Study 011 detection-panel figure, correct for the
16-person panel and used that way in the manuscript, research.html and
pilot.html. It was wrongly carried onto all 32 completers, who span 15
countries once Arm B is included.

Kyle McMullan resolves from "UK / Ireland" to the United Kingdom via his
bench_experts affiliation. Jean-Luc Adade stays recorded as the West
Africa region and is flagged as outside the 15.

Co-Authored-By: Claude Opus 5 <noreply@anthropic.com>
Claude-Session: https://claude.ai/code/session_01W9UtE7X76spacWeSvBH7tv
</commit_message>
<xml_diff>
--- a/research/Expert_Roster_All_Studies_2026-08-06.docx
+++ b/research/Expert_Roster_All_Studies_2026-08-06.docx
@@ -786,20 +786,20 @@
               <w:spacing w:after="0"/>
             </w:pPr>
             <w:r>
-              <w:t xml:space="preserve">Chief Audit Executive; internal audit and financial crimes</w:t>
-            </w:r>
-          </w:p>
-        </w:tc>
-        <w:tc>
-          <w:tcPr>
-            <w:tcW w:w="1872" w:type="dxa"/>
-          </w:tcPr>
-          <w:p>
-            <w:pPr>
-              <w:spacing w:after="0"/>
-            </w:pPr>
-            <w:r>
-              <w:t xml:space="preserve">UK / Ireland</w:t>
+              <w:t xml:space="preserve">Chief Audit Executive; internal audit and financial crimes; the audit hub, London</w:t>
+            </w:r>
+          </w:p>
+        </w:tc>
+        <w:tc>
+          <w:tcPr>
+            <w:tcW w:w="1872" w:type="dxa"/>
+          </w:tcPr>
+          <w:p>
+            <w:pPr>
+              <w:spacing w:after="0"/>
+            </w:pPr>
+            <w:r>
+              <w:t xml:space="preserve">United Kingdom</w:t>
             </w:r>
           </w:p>
         </w:tc>
@@ -1358,7 +1358,7 @@
         <w:t xml:space="preserve">Arm A countries: 11.</w:t>
       </w:r>
       <w:r>
-        <w:t xml:space="preserve"> US, Australia, India, Nigeria, Poland, UK/Ireland, Germany, South Korea, Singapore, UAE, Spain.</w:t>
+        <w:t xml:space="preserve"> US, Australia, India, Nigeria, Poland, United Kingdom, Germany, South Korea, Singapore, UAE, Spain. This is the figure the manuscript uses for the detection panel.</w:t>
       </w:r>
     </w:p>
     <w:p>
@@ -5340,7 +5340,7 @@
               <w:spacing w:after="0"/>
             </w:pPr>
             <w:r>
-              <w:t xml:space="preserve">Distinct countries recorded</w:t>
+              <w:t xml:space="preserve">Distinct countries across the 32 completers</w:t>
             </w:r>
           </w:p>
         </w:tc>
@@ -5353,7 +5353,13 @@
               <w:spacing w:after="0"/>
             </w:pPr>
             <w:r>
-              <w:t xml:space="preserve">15, plus one regional entry</w:t>
+              <w:rPr>
+                <w:b/>
+              </w:rPr>
+              <w:t xml:space="preserve">15</w:t>
+            </w:r>
+            <w:r>
+              <w:t xml:space="preserve">, plus one reviewer recorded only as West Africa</w:t>
             </w:r>
           </w:p>
         </w:tc>
@@ -5396,10 +5402,33 @@
         <w:rPr>
           <w:b/>
         </w:rPr>
-        <w:t xml:space="preserve">Two recording imprecisions, stated rather than smoothed over.</w:t>
-      </w:r>
-      <w:r>
-        <w:t xml:space="preserve"> Kyle McMullan is recorded as "UK / Ireland" and Jean-Luc Adade as "West Africa", so neither resolves to a single country in the study record. The published "11 countries" figure is the Arm A panel figure and is unaffected by both.</w:t>
+        <w:t xml:space="preserve">The 32 completers span 15 countries, not 11.</w:t>
+      </w:r>
+      <w:r>
+        <w:t xml:space="preserve"> US, Australia, India, Nigeria, Poland, United Kingdom, Germany, South Korea, Singapore, UAE, Spain, South Africa, Canada, Iran, Kenya. Eleven is the Study 011 detection-panel figure. It is correct for the 16-person panel, which is how the manuscript, research.html and pilot.html use it, and it was wrongly carried onto all 32 in the gate copy. Corrected in public copy on 2026-08-06.</w:t>
+      </w:r>
+    </w:p>
+    <w:p>
+      <w:pPr>
+        <w:spacing w:after="140"/>
+      </w:pPr>
+      <w:r>
+        <w:rPr>
+          <w:b/>
+        </w:rPr>
+        <w:t xml:space="preserve">One country still unresolved.</w:t>
+      </w:r>
+      <w:r>
+        <w:t xml:space="preserve"> Jean-Luc Adade is recorded as "West Africa", a region rather than a country, so he sits outside the 15 and the count would rise to 16 if his country were recorded. Kyle McMullan's earlier "UK / Ireland" entry is now resolved to the United Kingdom from his </w:t>
+      </w:r>
+      <w:r>
+        <w:rPr>
+          <w:rFonts w:ascii="Consolas" w:hAnsi="Consolas"/>
+        </w:rPr>
+        <w:t xml:space="preserve">bench_experts</w:t>
+      </w:r>
+      <w:r>
+        <w:t xml:space="preserve"> affiliation, "the audit hub (London, United Kingdom)".</w:t>
       </w:r>
     </w:p>
     <w:p>

</xml_diff>

<commit_message>
Cote d'Ivoire, 53 international reviewers, and the reviewer count basis
Jean-Luc Adade's country is Cote d'Ivoire, the last completer carrying a
region rather than a country, so the completer country count is 16. The
reviewer figure moves 52 to 53: the sentence says reviewers have graded
records, so the basis is everyone with at least one graded read, which
adds RR-108 at 9 of 24. E-11 stays out, unresolvable to a person.

Copy now reads "international reviewers across three studies".

Co-Authored-By: Claude Opus 5 <noreply@anthropic.com>
Claude-Session: https://claude.ai/code/session_01W9UtE7X76spacWeSvBH7tv
</commit_message>
<xml_diff>
--- a/research/Expert_Roster_All_Studies_2026-08-06.docx
+++ b/research/Expert_Roster_All_Studies_2026-08-06.docx
@@ -162,7 +162,7 @@
         <w:rPr>
           <w:b/>
         </w:rPr>
-        <w:t xml:space="preserve">Totals: 52 distinct people across three studies. 32 completed a full 24-record set. 35 named.</w:t>
+        <w:t xml:space="preserve">Totals: 53 international reviewers have graded records across three studies. 32 completed a full 24-record set. 35 named.</w:t>
       </w:r>
     </w:p>
     <w:p>
@@ -732,7 +732,7 @@
               <w:spacing w:after="0"/>
             </w:pPr>
             <w:r>
-              <w:t xml:space="preserve">Poland / EU</w:t>
+              <w:t xml:space="preserve">Poland</w:t>
             </w:r>
           </w:p>
         </w:tc>
@@ -866,7 +866,7 @@
               <w:spacing w:after="0"/>
             </w:pPr>
             <w:r>
-              <w:t xml:space="preserve">Poland / EU</w:t>
+              <w:t xml:space="preserve">Poland</w:t>
             </w:r>
           </w:p>
         </w:tc>
@@ -1948,7 +1948,7 @@
               <w:spacing w:after="0"/>
             </w:pPr>
             <w:r>
-              <w:t xml:space="preserve">West Africa</w:t>
+              <w:t xml:space="preserve">Cote d'Ivoire</w:t>
             </w:r>
           </w:p>
         </w:tc>
@@ -2801,7 +2801,7 @@
         <w:t xml:space="preserve">Arm B countries among the 14 named: 9.</w:t>
       </w:r>
       <w:r>
-        <w:t xml:space="preserve"> US, South Africa, Canada, Iran, Australia, Singapore, Nigeria, Kenya, plus one recorded only as the West Africa region.</w:t>
+        <w:t xml:space="preserve"> US, South Africa, Canada, Iran, Australia, Singapore, Nigeria, Kenya, Cote d'Ivoire.</w:t>
       </w:r>
     </w:p>
     <w:p>
@@ -5073,7 +5073,7 @@
               <w:rPr>
                 <w:b/>
               </w:rPr>
-              <w:t xml:space="preserve">Distinct people across all three studies</w:t>
+              <w:t xml:space="preserve">International reviewers who have graded records, all three studies</w:t>
             </w:r>
           </w:p>
         </w:tc>
@@ -5089,7 +5089,7 @@
               <w:rPr>
                 <w:b/>
               </w:rPr>
-              <w:t xml:space="preserve">52</w:t>
+              <w:t xml:space="preserve">53</w:t>
             </w:r>
           </w:p>
         </w:tc>
@@ -5132,7 +5132,35 @@
               <w:spacing w:after="0"/>
             </w:pPr>
             <w:r>
-              <w:t xml:space="preserve">Study 004 expert raters who are NOT already completers</w:t>
+              <w:t xml:space="preserve">Graded records but not yet a full set</w:t>
+            </w:r>
+          </w:p>
+        </w:tc>
+        <w:tc>
+          <w:tcPr>
+            <w:tcW w:w="4680" w:type="dxa"/>
+          </w:tcPr>
+          <w:p>
+            <w:pPr>
+              <w:spacing w:after="0"/>
+            </w:pPr>
+            <w:r>
+              <w:t xml:space="preserve">1 (RR-108, Archana Dhinakaran, 9 of 24)</w:t>
+            </w:r>
+          </w:p>
+        </w:tc>
+      </w:tr>
+      <w:tr>
+        <w:tc>
+          <w:tcPr>
+            <w:tcW w:w="4680" w:type="dxa"/>
+          </w:tcPr>
+          <w:p>
+            <w:pPr>
+              <w:spacing w:after="0"/>
+            </w:pPr>
+            <w:r>
+              <w:t xml:space="preserve">Study 004 expert raters who are NOT already counted</w:t>
             </w:r>
           </w:p>
         </w:tc>
@@ -5356,10 +5384,7 @@
               <w:rPr>
                 <w:b/>
               </w:rPr>
-              <w:t xml:space="preserve">15</w:t>
-            </w:r>
-            <w:r>
-              <w:t xml:space="preserve">, plus one reviewer recorded only as West Africa</w:t>
+              <w:t xml:space="preserve">16</w:t>
             </w:r>
           </w:p>
         </w:tc>
@@ -5379,19 +5404,19 @@
         <w:rPr>
           <w:b/>
         </w:rPr>
-        <w:t xml:space="preserve">52 is a distinct-human count, not a code count.</w:t>
-      </w:r>
-      <w:r>
-        <w:t xml:space="preserve"> The earlier published figure of 48 was a floor built when the </w:t>
+        <w:t xml:space="preserve">53 is a distinct-human count on a graded-records basis.</w:t>
+      </w:r>
+      <w:r>
+        <w:t xml:space="preserve"> The public sentence says reviewers have graded records, so the figure counts everyone who submitted at least one graded read rather than only those who finished a full set. That is 16 in Arm A, 17 in Arm B, 4 Study 004 expert raters the other studies never touched, and the 16 anonymous bench reviewers. E-11 stays out because one label and a null identity row cannot be resolved to a person; counting it would give 54. Reproduce with </w:t>
       </w:r>
       <w:r>
         <w:rPr>
           <w:rFonts w:ascii="Consolas" w:hAnsi="Consolas"/>
         </w:rPr>
-        <w:t xml:space="preserve">E-</w:t>
-      </w:r>
-      <w:r>
-        <w:t xml:space="preserve"> identities could not be read and all eight had to be assumed to be panel members already counted. With the identities now read, exactly three are, so four more real people are added. E-11 stays out because it cannot be resolved to a person.</w:t>
+        <w:t xml:space="preserve">research/count_participants.py</w:t>
+      </w:r>
+      <w:r>
+        <w:t xml:space="preserve">.</w:t>
       </w:r>
     </w:p>
     <w:p>
@@ -5402,10 +5427,10 @@
         <w:rPr>
           <w:b/>
         </w:rPr>
-        <w:t xml:space="preserve">The 32 completers span 15 countries, not 11.</w:t>
-      </w:r>
-      <w:r>
-        <w:t xml:space="preserve"> US, Australia, India, Nigeria, Poland, United Kingdom, Germany, South Korea, Singapore, UAE, Spain, South Africa, Canada, Iran, Kenya. Eleven is the Study 011 detection-panel figure. It is correct for the 16-person panel, which is how the manuscript, research.html and pilot.html use it, and it was wrongly carried onto all 32 in the gate copy. Corrected in public copy on 2026-08-06.</w:t>
+        <w:t xml:space="preserve">The 32 completers span 16 countries, not 11.</w:t>
+      </w:r>
+      <w:r>
+        <w:t xml:space="preserve"> US, Australia, India, Nigeria, Poland, United Kingdom, Germany, South Korea, Singapore, UAE, Spain, South Africa, Canada, Iran, Kenya, Cote d'Ivoire. Eleven is the Study 011 detection-panel figure. It is correct for the 16-person panel, which is how the manuscript, research.html and pilot.html use it, and it was wrongly carried onto all 32 in the gate copy. Corrected in public copy on 2026-08-06.</w:t>
       </w:r>
     </w:p>
     <w:p>
@@ -5416,10 +5441,10 @@
         <w:rPr>
           <w:b/>
         </w:rPr>
-        <w:t xml:space="preserve">One country still unresolved.</w:t>
-      </w:r>
-      <w:r>
-        <w:t xml:space="preserve"> Jean-Luc Adade is recorded as "West Africa", a region rather than a country, so he sits outside the 15 and the count would rise to 16 if his country were recorded. Kyle McMullan's earlier "UK / Ireland" entry is now resolved to the United Kingdom from his </w:t>
+        <w:t xml:space="preserve">Both country gaps are now closed.</w:t>
+      </w:r>
+      <w:r>
+        <w:t xml:space="preserve"> Jean-Luc Adade's country is Cote d'Ivoire, supplied by the owner on 2026-08-06, replacing the "West Africa" region entry. Kyle McMullan's earlier "UK / Ireland" entry resolved to the United Kingdom from his </w:t>
       </w:r>
       <w:r>
         <w:rPr>
@@ -5428,7 +5453,7 @@
         <w:t xml:space="preserve">bench_experts</w:t>
       </w:r>
       <w:r>
-        <w:t xml:space="preserve"> affiliation, "the audit hub (London, United Kingdom)".</w:t>
+        <w:t xml:space="preserve"> affiliation, "the audit hub (London, United Kingdom)". Every one of the 30 named completers now carries a country; the only two without one are the two anonymous Arm B participants.</w:t>
       </w:r>
     </w:p>
     <w:p>

</xml_diff>